<commit_message>
Add API authentication and SMS delivery support
</commit_message>
<xml_diff>
--- a/docs/UABAMS_Cloud_Quick_Handoff_3_Pages.docx
+++ b/docs/UABAMS_Cloud_Quick_Handoff_3_Pages.docx
@@ -677,7 +677,7 @@
               <w:rPr>
                 <w:sz w:val="15"/>
               </w:rPr>
-              <w:t>HTTPS PUT/POST to /api/v1/archive. Body is a closed session archive or demo JSON during review. Production must add gateway token/mTLS.</w:t>
+              <w:t>HTTPS PUT/POST to /api/v1/archive. Body is a closed session archive or demo JSON during review. Production uses bearer token/API key; mTLS can be added by deployer.</w:t>
             </w:r>
           </w:p>
         </w:tc>
@@ -869,7 +869,7 @@
               <w:rPr>
                 <w:sz w:val="15"/>
               </w:rPr>
-              <w:t>Validate upload, parse records, calculate dashboard summaries, compare peak values with route-wise vertical/lateral thresholds, generate GPS alerts.</w:t>
+              <w:t>Authenticate request, validate upload, parse records, calculate dashboard summaries, compare peak values with route-wise vertical/lateral thresholds, generate GPS alerts.</w:t>
             </w:r>
           </w:p>
         </w:tc>
@@ -918,6 +918,54 @@
                 <w:sz w:val="15"/>
               </w:rPr>
               <w:t>Configuration JSON: route threshold, wheel wear/correction factor, sampling rate. Gateway polling/ack should be finalized in production.</w:t>
+            </w:r>
+          </w:p>
+        </w:tc>
+      </w:tr>
+      <w:tr>
+        <w:tc>
+          <w:tcPr>
+            <w:tcW w:type="dxa" w:w="2376"/>
+            <w:vAlign w:val="center"/>
+            <w:tcMar>
+              <w:top w:w="70" w:type="dxa"/>
+              <w:start w:w="90" w:type="dxa"/>
+              <w:bottom w:w="70" w:type="dxa"/>
+              <w:end w:w="90" w:type="dxa"/>
+            </w:tcMar>
+          </w:tcPr>
+          <w:p>
+            <w:pPr>
+              <w:spacing w:after="0"/>
+            </w:pPr>
+            <w:r>
+              <w:rPr>
+                <w:sz w:val="15"/>
+              </w:rPr>
+              <w:t>Cloud sends to SMS server</w:t>
+            </w:r>
+          </w:p>
+        </w:tc>
+        <w:tc>
+          <w:tcPr>
+            <w:tcW w:type="dxa" w:w="7343"/>
+            <w:vAlign w:val="center"/>
+            <w:tcMar>
+              <w:top w:w="70" w:type="dxa"/>
+              <w:start w:w="90" w:type="dxa"/>
+              <w:bottom w:w="70" w:type="dxa"/>
+              <w:end w:w="90" w:type="dxa"/>
+            </w:tcMar>
+          </w:tcPr>
+          <w:p>
+            <w:pPr>
+              <w:spacing w:after="0"/>
+            </w:pPr>
+            <w:r>
+              <w:rPr>
+                <w:sz w:val="15"/>
+              </w:rPr>
+              <w:t>When an alert is generated, cloud posts SMS JSON to SMS_SERVER_URL and stores success/failure in notification_deliveries.</w:t>
             </w:r>
           </w:p>
         </w:tc>
@@ -1103,6 +1151,41 @@
           <w:sz w:val="14"/>
         </w:rPr>
         <w:t xml:space="preserve"> "lateralThreshold":80,"samplingRate":2500,"correctionFactor":1.02}</w:t>
+        <w:br/>
+      </w:r>
+      <w:r>
+        <w:rPr>
+          <w:rFonts w:ascii="Consolas" w:hAnsi="Consolas"/>
+          <w:color w:val="1F2933"/>
+          <w:sz w:val="14"/>
+        </w:rPr>
+        <w:br/>
+      </w:r>
+      <w:r>
+        <w:rPr>
+          <w:rFonts w:ascii="Consolas" w:hAnsi="Consolas"/>
+          <w:color w:val="1F2933"/>
+          <w:sz w:val="14"/>
+        </w:rPr>
+        <w:t>SMS server JSON:</w:t>
+        <w:br/>
+      </w:r>
+      <w:r>
+        <w:rPr>
+          <w:rFonts w:ascii="Consolas" w:hAnsi="Consolas"/>
+          <w:color w:val="1F2933"/>
+          <w:sz w:val="14"/>
+        </w:rPr>
+        <w:t>{"to":["+91xxxxxxxxxx"],"message":"UABAMS Info: vertical 77.2g...",</w:t>
+        <w:br/>
+      </w:r>
+      <w:r>
+        <w:rPr>
+          <w:rFonts w:ascii="Consolas" w:hAnsi="Consolas"/>
+          <w:color w:val="1F2933"/>
+          <w:sz w:val="14"/>
+        </w:rPr>
+        <w:t xml:space="preserve"> "alert":{"gatewayId":"GW004","trainId":"TRAIN21","gps":{"lat":13.15,"lon":77.73}}}</w:t>
         <w:br/>
       </w:r>
     </w:p>
@@ -1628,8 +1711,413 @@
     </w:p>
     <w:p>
       <w:r>
-        <w:t>Before production, Railman still must finalize: authentication, exact MDB schema/import method with CRIS, durable object storage for archives, SMS/notification provider, and hardware MMD/SOD compliance evidence.</w:t>
+        <w:t>Before production, Railman still must finalize: exact MDB schema/import method with CRIS, durable object storage for archives, SMS provider credentials/recipients, and hardware MMD/SOD compliance evidence.</w:t>
       </w:r>
+    </w:p>
+    <w:tbl>
+      <w:tblPr>
+        <w:tblStyle w:val="TableGrid"/>
+        <w:tblW w:type="auto" w:w="0"/>
+        <w:tblLayout w:type="fixed"/>
+        <w:tblLook w:firstColumn="1" w:firstRow="1" w:lastColumn="0" w:lastRow="0" w:noHBand="0" w:noVBand="1" w:val="04A0"/>
+      </w:tblPr>
+      <w:tblGrid>
+        <w:gridCol w:w="3168"/>
+        <w:gridCol w:w="6552"/>
+      </w:tblGrid>
+      <w:tr>
+        <w:tc>
+          <w:tcPr>
+            <w:tcW w:type="dxa" w:w="3168"/>
+            <w:shd w:fill="E8EEF5"/>
+            <w:tcMar>
+              <w:top w:w="70" w:type="dxa"/>
+              <w:start w:w="90" w:type="dxa"/>
+              <w:bottom w:w="70" w:type="dxa"/>
+              <w:end w:w="90" w:type="dxa"/>
+            </w:tcMar>
+          </w:tcPr>
+          <w:p>
+            <w:pPr>
+              <w:jc w:val="center"/>
+            </w:pPr>
+            <w:r>
+              <w:rPr>
+                <w:b/>
+                <w:color w:val="123A63"/>
+                <w:sz w:val="14"/>
+              </w:rPr>
+              <w:t>Production env variable</w:t>
+            </w:r>
+          </w:p>
+        </w:tc>
+        <w:tc>
+          <w:tcPr>
+            <w:tcW w:type="dxa" w:w="6552"/>
+            <w:shd w:fill="E8EEF5"/>
+            <w:tcMar>
+              <w:top w:w="70" w:type="dxa"/>
+              <w:start w:w="90" w:type="dxa"/>
+              <w:bottom w:w="70" w:type="dxa"/>
+              <w:end w:w="90" w:type="dxa"/>
+            </w:tcMar>
+          </w:tcPr>
+          <w:p>
+            <w:pPr>
+              <w:jc w:val="center"/>
+            </w:pPr>
+            <w:r>
+              <w:rPr>
+                <w:b/>
+                <w:color w:val="123A63"/>
+                <w:sz w:val="14"/>
+              </w:rPr>
+              <w:t>Purpose</w:t>
+            </w:r>
+          </w:p>
+        </w:tc>
+      </w:tr>
+      <w:tr>
+        <w:tc>
+          <w:tcPr>
+            <w:tcW w:type="dxa" w:w="3168"/>
+            <w:vAlign w:val="center"/>
+            <w:tcMar>
+              <w:top w:w="70" w:type="dxa"/>
+              <w:start w:w="90" w:type="dxa"/>
+              <w:bottom w:w="70" w:type="dxa"/>
+              <w:end w:w="90" w:type="dxa"/>
+            </w:tcMar>
+          </w:tcPr>
+          <w:p>
+            <w:pPr>
+              <w:spacing w:after="0"/>
+            </w:pPr>
+            <w:r>
+              <w:rPr>
+                <w:sz w:val="14"/>
+              </w:rPr>
+              <w:t>DATABASE_URL</w:t>
+            </w:r>
+          </w:p>
+        </w:tc>
+        <w:tc>
+          <w:tcPr>
+            <w:tcW w:type="dxa" w:w="6552"/>
+            <w:vAlign w:val="center"/>
+            <w:tcMar>
+              <w:top w:w="70" w:type="dxa"/>
+              <w:start w:w="90" w:type="dxa"/>
+              <w:bottom w:w="70" w:type="dxa"/>
+              <w:end w:w="90" w:type="dxa"/>
+            </w:tcMar>
+          </w:tcPr>
+          <w:p>
+            <w:pPr>
+              <w:spacing w:after="0"/>
+            </w:pPr>
+            <w:r>
+              <w:rPr>
+                <w:sz w:val="14"/>
+              </w:rPr>
+              <w:t>PostgreSQL cloud database</w:t>
+            </w:r>
+          </w:p>
+        </w:tc>
+      </w:tr>
+      <w:tr>
+        <w:tc>
+          <w:tcPr>
+            <w:tcW w:type="dxa" w:w="3168"/>
+            <w:vAlign w:val="center"/>
+            <w:tcMar>
+              <w:top w:w="70" w:type="dxa"/>
+              <w:start w:w="90" w:type="dxa"/>
+              <w:bottom w:w="70" w:type="dxa"/>
+              <w:end w:w="90" w:type="dxa"/>
+            </w:tcMar>
+          </w:tcPr>
+          <w:p>
+            <w:pPr>
+              <w:spacing w:after="0"/>
+            </w:pPr>
+            <w:r>
+              <w:rPr>
+                <w:sz w:val="14"/>
+              </w:rPr>
+              <w:t>API_AUTH_TOKEN</w:t>
+            </w:r>
+          </w:p>
+        </w:tc>
+        <w:tc>
+          <w:tcPr>
+            <w:tcW w:type="dxa" w:w="6552"/>
+            <w:vAlign w:val="center"/>
+            <w:tcMar>
+              <w:top w:w="70" w:type="dxa"/>
+              <w:start w:w="90" w:type="dxa"/>
+              <w:bottom w:w="70" w:type="dxa"/>
+              <w:end w:w="90" w:type="dxa"/>
+            </w:tcMar>
+          </w:tcPr>
+          <w:p>
+            <w:pPr>
+              <w:spacing w:after="0"/>
+            </w:pPr>
+            <w:r>
+              <w:rPr>
+                <w:sz w:val="14"/>
+              </w:rPr>
+              <w:t>Operator/frontend API authentication</w:t>
+            </w:r>
+          </w:p>
+        </w:tc>
+      </w:tr>
+      <w:tr>
+        <w:tc>
+          <w:tcPr>
+            <w:tcW w:type="dxa" w:w="3168"/>
+            <w:vAlign w:val="center"/>
+            <w:tcMar>
+              <w:top w:w="70" w:type="dxa"/>
+              <w:start w:w="90" w:type="dxa"/>
+              <w:bottom w:w="70" w:type="dxa"/>
+              <w:end w:w="90" w:type="dxa"/>
+            </w:tcMar>
+          </w:tcPr>
+          <w:p>
+            <w:pPr>
+              <w:spacing w:after="0"/>
+            </w:pPr>
+            <w:r>
+              <w:rPr>
+                <w:sz w:val="14"/>
+              </w:rPr>
+              <w:t>GATEWAY_API_TOKEN</w:t>
+            </w:r>
+          </w:p>
+        </w:tc>
+        <w:tc>
+          <w:tcPr>
+            <w:tcW w:type="dxa" w:w="6552"/>
+            <w:vAlign w:val="center"/>
+            <w:tcMar>
+              <w:top w:w="70" w:type="dxa"/>
+              <w:start w:w="90" w:type="dxa"/>
+              <w:bottom w:w="70" w:type="dxa"/>
+              <w:end w:w="90" w:type="dxa"/>
+            </w:tcMar>
+          </w:tcPr>
+          <w:p>
+            <w:pPr>
+              <w:spacing w:after="0"/>
+            </w:pPr>
+            <w:r>
+              <w:rPr>
+                <w:sz w:val="14"/>
+              </w:rPr>
+              <w:t>Gateway archive/config authentication</w:t>
+            </w:r>
+          </w:p>
+        </w:tc>
+      </w:tr>
+      <w:tr>
+        <w:tc>
+          <w:tcPr>
+            <w:tcW w:type="dxa" w:w="3168"/>
+            <w:vAlign w:val="center"/>
+            <w:tcMar>
+              <w:top w:w="70" w:type="dxa"/>
+              <w:start w:w="90" w:type="dxa"/>
+              <w:bottom w:w="70" w:type="dxa"/>
+              <w:end w:w="90" w:type="dxa"/>
+            </w:tcMar>
+          </w:tcPr>
+          <w:p>
+            <w:pPr>
+              <w:spacing w:after="0"/>
+            </w:pPr>
+            <w:r>
+              <w:rPr>
+                <w:sz w:val="14"/>
+              </w:rPr>
+              <w:t>VITE_API_TOKEN</w:t>
+            </w:r>
+          </w:p>
+        </w:tc>
+        <w:tc>
+          <w:tcPr>
+            <w:tcW w:type="dxa" w:w="6552"/>
+            <w:vAlign w:val="center"/>
+            <w:tcMar>
+              <w:top w:w="70" w:type="dxa"/>
+              <w:start w:w="90" w:type="dxa"/>
+              <w:bottom w:w="70" w:type="dxa"/>
+              <w:end w:w="90" w:type="dxa"/>
+            </w:tcMar>
+          </w:tcPr>
+          <w:p>
+            <w:pPr>
+              <w:spacing w:after="0"/>
+            </w:pPr>
+            <w:r>
+              <w:rPr>
+                <w:sz w:val="14"/>
+              </w:rPr>
+              <w:t>Frontend token matching API_AUTH_TOKEN</w:t>
+            </w:r>
+          </w:p>
+        </w:tc>
+      </w:tr>
+      <w:tr>
+        <w:tc>
+          <w:tcPr>
+            <w:tcW w:type="dxa" w:w="3168"/>
+            <w:vAlign w:val="center"/>
+            <w:tcMar>
+              <w:top w:w="70" w:type="dxa"/>
+              <w:start w:w="90" w:type="dxa"/>
+              <w:bottom w:w="70" w:type="dxa"/>
+              <w:end w:w="90" w:type="dxa"/>
+            </w:tcMar>
+          </w:tcPr>
+          <w:p>
+            <w:pPr>
+              <w:spacing w:after="0"/>
+            </w:pPr>
+            <w:r>
+              <w:rPr>
+                <w:sz w:val="14"/>
+              </w:rPr>
+              <w:t>SMS_SERVER_URL</w:t>
+            </w:r>
+          </w:p>
+        </w:tc>
+        <w:tc>
+          <w:tcPr>
+            <w:tcW w:type="dxa" w:w="6552"/>
+            <w:vAlign w:val="center"/>
+            <w:tcMar>
+              <w:top w:w="70" w:type="dxa"/>
+              <w:start w:w="90" w:type="dxa"/>
+              <w:bottom w:w="70" w:type="dxa"/>
+              <w:end w:w="90" w:type="dxa"/>
+            </w:tcMar>
+          </w:tcPr>
+          <w:p>
+            <w:pPr>
+              <w:spacing w:after="0"/>
+            </w:pPr>
+            <w:r>
+              <w:rPr>
+                <w:sz w:val="14"/>
+              </w:rPr>
+              <w:t>SMS server endpoint for alert messages</w:t>
+            </w:r>
+          </w:p>
+        </w:tc>
+      </w:tr>
+      <w:tr>
+        <w:tc>
+          <w:tcPr>
+            <w:tcW w:type="dxa" w:w="3168"/>
+            <w:vAlign w:val="center"/>
+            <w:tcMar>
+              <w:top w:w="70" w:type="dxa"/>
+              <w:start w:w="90" w:type="dxa"/>
+              <w:bottom w:w="70" w:type="dxa"/>
+              <w:end w:w="90" w:type="dxa"/>
+            </w:tcMar>
+          </w:tcPr>
+          <w:p>
+            <w:pPr>
+              <w:spacing w:after="0"/>
+            </w:pPr>
+            <w:r>
+              <w:rPr>
+                <w:sz w:val="14"/>
+              </w:rPr>
+              <w:t>SMS_SERVER_BEARER_TOKEN</w:t>
+            </w:r>
+          </w:p>
+        </w:tc>
+        <w:tc>
+          <w:tcPr>
+            <w:tcW w:type="dxa" w:w="6552"/>
+            <w:vAlign w:val="center"/>
+            <w:tcMar>
+              <w:top w:w="70" w:type="dxa"/>
+              <w:start w:w="90" w:type="dxa"/>
+              <w:bottom w:w="70" w:type="dxa"/>
+              <w:end w:w="90" w:type="dxa"/>
+            </w:tcMar>
+          </w:tcPr>
+          <w:p>
+            <w:pPr>
+              <w:spacing w:after="0"/>
+            </w:pPr>
+            <w:r>
+              <w:rPr>
+                <w:sz w:val="14"/>
+              </w:rPr>
+              <w:t>SMS server authentication token</w:t>
+            </w:r>
+          </w:p>
+        </w:tc>
+      </w:tr>
+      <w:tr>
+        <w:tc>
+          <w:tcPr>
+            <w:tcW w:type="dxa" w:w="3168"/>
+            <w:vAlign w:val="center"/>
+            <w:tcMar>
+              <w:top w:w="70" w:type="dxa"/>
+              <w:start w:w="90" w:type="dxa"/>
+              <w:bottom w:w="70" w:type="dxa"/>
+              <w:end w:w="90" w:type="dxa"/>
+            </w:tcMar>
+          </w:tcPr>
+          <w:p>
+            <w:pPr>
+              <w:spacing w:after="0"/>
+            </w:pPr>
+            <w:r>
+              <w:rPr>
+                <w:sz w:val="14"/>
+              </w:rPr>
+              <w:t>SMS_RECIPIENTS</w:t>
+            </w:r>
+          </w:p>
+        </w:tc>
+        <w:tc>
+          <w:tcPr>
+            <w:tcW w:type="dxa" w:w="6552"/>
+            <w:vAlign w:val="center"/>
+            <w:tcMar>
+              <w:top w:w="70" w:type="dxa"/>
+              <w:start w:w="90" w:type="dxa"/>
+              <w:bottom w:w="70" w:type="dxa"/>
+              <w:end w:w="90" w:type="dxa"/>
+            </w:tcMar>
+          </w:tcPr>
+          <w:p>
+            <w:pPr>
+              <w:spacing w:after="0"/>
+            </w:pPr>
+            <w:r>
+              <w:rPr>
+                <w:sz w:val="14"/>
+              </w:rPr>
+              <w:t>Comma-separated officials/recipient numbers</w:t>
+            </w:r>
+          </w:p>
+        </w:tc>
+      </w:tr>
+    </w:tbl>
+    <w:p>
+      <w:pPr>
+        <w:spacing w:after="0"/>
+      </w:pPr>
     </w:p>
     <w:sectPr>
       <w:pgSz w:w="12240" w:h="15840"/>

</xml_diff>

<commit_message>
Add demo SMS server mode
</commit_message>
<xml_diff>
--- a/docs/UABAMS_Cloud_Quick_Handoff_3_Pages.docx
+++ b/docs/UABAMS_Cloud_Quick_Handoff_3_Pages.docx
@@ -965,7 +965,7 @@
               <w:rPr>
                 <w:sz w:val="15"/>
               </w:rPr>
-              <w:t>When an alert is generated, cloud posts SMS JSON to SMS_SERVER_URL and stores success/failure in notification_deliveries.</w:t>
+              <w:t>When an alert is generated, cloud posts SMS JSON to SMS_SERVER_URL and stores success/failure in notification_deliveries. For demo, set SMS_SERVER_URL=demo.</w:t>
             </w:r>
           </w:p>
         </w:tc>
@@ -2012,7 +2012,7 @@
               <w:rPr>
                 <w:sz w:val="14"/>
               </w:rPr>
-              <w:t>SMS server endpoint for alert messages</w:t>
+              <w:t>SMS server endpoint for alert messages; use demo for review</w:t>
             </w:r>
           </w:p>
         </w:tc>

</xml_diff>